<commit_message>
refactor: emit simpler C for common statements and loops
</commit_message>
<xml_diff>
--- a/docs/Phase2_Implementation_Progress_Report.docx
+++ b/docs/Phase2_Implementation_Progress_Report.docx
@@ -1411,9 +1411,7 @@
         <w:br/>
         <w:t>Generated C branch excerpt</w:t>
         <w:br/>
-        <w:t>int t1 = (mark &gt;= 50);</w:t>
-        <w:br/>
-        <w:t>if (t1) {</w:t>
+        <w:t>if (mark &gt;= 50) {</w:t>
         <w:br/>
         <w:t xml:space="preserve">    printf("%s\n", "Pass");</w:t>
         <w:br/>
@@ -1479,11 +1477,11 @@
         <w:br/>
         <w:t>while (i &lt;= 3) {</w:t>
         <w:br/>
-        <w:t xml:space="preserve">    int t1 = values[0];</w:t>
-        <w:br/>
-        <w:t xml:space="preserve">    printf("%d\n", t1);</w:t>
-        <w:br/>
-        <w:t xml:space="preserve">    /* iterator update and overflow guard follow */</w:t>
+        <w:t xml:space="preserve">    printf("%d\n", values[0]);</w:t>
+        <w:br/>
+        <w:t xml:space="preserve">    if ((long long)i + (1) &gt; 3) break;</w:t>
+        <w:br/>
+        <w:t xml:space="preserve">    i += 1;</w:t>
         <w:br/>
         <w:t>}</w:t>
       </w:r>
@@ -1557,15 +1555,11 @@
         <w:br/>
         <w:t>rightValue = 2;</w:t>
         <w:br/>
-        <w:t>int t1 = (leftValue | rightValue);</w:t>
-        <w:br/>
-        <w:t>mask = t1;</w:t>
+        <w:t>mask = (leftValue | rightValue);</w:t>
         <w:br/>
         <w:t>printf("%s\n", name);</w:t>
         <w:br/>
-        <w:t>int t2 = (mask &amp; 3);</w:t>
-        <w:br/>
-        <w:t>printf("%d\n", t2);</w:t>
+        <w:t>printf("%d\n", (mask &amp; 3));</w:t>
       </w:r>
     </w:p>
     <w:p>
@@ -1634,19 +1628,13 @@
         <w:br/>
         <w:t>Generated C excerpt</w:t>
         <w:br/>
-        <w:t>while ((i &lt; limit)) {</w:t>
-        <w:br/>
-        <w:t xml:space="preserve">    int t2 = (i + 1);</w:t>
-        <w:br/>
-        <w:t xml:space="preserve">    i = t2;</w:t>
-        <w:br/>
-        <w:t xml:space="preserve">    int t3 = (i == 2);</w:t>
-        <w:br/>
-        <w:t xml:space="preserve">    if (t3) { continue; }</w:t>
-        <w:br/>
-        <w:t xml:space="preserve">    int t4 = (i == 5);</w:t>
-        <w:br/>
-        <w:t xml:space="preserve">    if (t4) { break; }</w:t>
+        <w:t>while (i &lt; limit) {</w:t>
+        <w:br/>
+        <w:t xml:space="preserve">    i = (i + 1);</w:t>
+        <w:br/>
+        <w:t xml:space="preserve">    if (i == 2) { continue; }</w:t>
+        <w:br/>
+        <w:t xml:space="preserve">    if (i == 5) { break; }</w:t>
         <w:br/>
         <w:t>}</w:t>
       </w:r>
@@ -1949,8 +1937,6 @@
         <w:t>Generated C</w:t>
         <w:br/>
         <w:t>#include &lt;stdio.h&gt;</w:t>
-        <w:br/>
-        <w:t>#include &lt;limits.h&gt;</w:t>
         <w:br/>
         <w:br/>
         <w:t>int main(void) {</w:t>

</xml_diff>

<commit_message>
refactor: generate C for loops without goto
</commit_message>
<xml_diff>
--- a/docs/Phase2_Implementation_Progress_Report.docx
+++ b/docs/Phase2_Implementation_Progress_Report.docx
@@ -1473,15 +1473,9 @@
         <w:br/>
         <w:t>values[0] = 7;</w:t>
         <w:br/>
-        <w:t>i = 1;</w:t>
-        <w:br/>
-        <w:t>while (i &lt;= 3) {</w:t>
+        <w:t>for (i = 1; i &lt;= 3; i++) {</w:t>
         <w:br/>
         <w:t xml:space="preserve">    printf("%d\n", values[0]);</w:t>
-        <w:br/>
-        <w:t xml:space="preserve">    if ((long long)i + (1) &gt; 3) break;</w:t>
-        <w:br/>
-        <w:t xml:space="preserve">    i += 1;</w:t>
         <w:br/>
         <w:t>}</w:t>
       </w:r>

</xml_diff>